<commit_message>
Fin du workflow de demande d'actes
</commit_message>
<xml_diff>
--- a/backend/templates/word/certificat_non_jouissance_template.docx
+++ b/backend/templates/word/certificat_non_jouissance_template.docx
@@ -190,6 +190,7 @@
           <w:szCs w:val="24"/>
         </w:rPr>
       </w:pPr>
+      <w:proofErr w:type="gramStart"/>
       <w:r>
         <w:rPr>
           <w:rFonts w:ascii="Trebuchet MS" w:hAnsi="Trebuchet MS"/>
@@ -197,7 +198,17 @@
           <w:sz w:val="24"/>
           <w:szCs w:val="24"/>
         </w:rPr>
-        <w:t xml:space="preserve">de l’Administration et des Finances </w:t>
+        <w:t>de</w:t>
+      </w:r>
+      <w:proofErr w:type="gramEnd"/>
+      <w:r>
+        <w:rPr>
+          <w:rFonts w:ascii="Trebuchet MS" w:hAnsi="Trebuchet MS"/>
+          <w:b/>
+          <w:sz w:val="24"/>
+          <w:szCs w:val="24"/>
+        </w:rPr>
+        <w:t xml:space="preserve"> l’Administration et des Finances </w:t>
       </w:r>
     </w:p>
     <w:p>
@@ -697,6 +708,7 @@
       <w:pPr>
         <w:spacing w:after="0" w:line="360" w:lineRule="auto"/>
         <w:ind w:left="3540" w:firstLine="708"/>
+        <w:jc w:val="right"/>
         <w:rPr>
           <w:rFonts w:ascii="Trebuchet MS" w:eastAsia="Times New Roman" w:hAnsi="Trebuchet MS" w:cs="Times New Roman"/>
           <w:b/>
@@ -715,34 +727,28 @@
         </w:rPr>
         <w:t xml:space="preserve"> </w:t>
       </w:r>
-    </w:p>
-    <w:p>
-      <w:pPr>
-        <w:pStyle w:val="Retraitcorpsdetexte31"/>
-        <w:tabs>
-          <w:tab w:val="left" w:pos="5103"/>
-        </w:tabs>
-        <w:spacing w:line="360" w:lineRule="auto"/>
-        <w:ind w:firstLine="0"/>
+      <w:r>
         <w:rPr>
           <w:rFonts w:ascii="Trebuchet MS" w:hAnsi="Trebuchet MS"/>
           <w:b/>
-          <w:lang w:val="en-US" w:eastAsia="fr-FR"/>
-        </w:rPr>
-      </w:pPr>
+        </w:rPr>
+        <w:t xml:space="preserve">Augustine </w:t>
+      </w:r>
+      <w:proofErr w:type="spellStart"/>
       <w:r>
         <w:rPr>
           <w:rFonts w:ascii="Trebuchet MS" w:hAnsi="Trebuchet MS"/>
           <w:b/>
         </w:rPr>
-        <w:tab/>
-      </w:r>
+        <w:t>Tognissè</w:t>
+      </w:r>
+      <w:proofErr w:type="spellEnd"/>
       <w:r>
         <w:rPr>
           <w:rFonts w:ascii="Trebuchet MS" w:hAnsi="Trebuchet MS"/>
           <w:b/>
         </w:rPr>
-        <w:t>Augustine Tognissè CAKPO SOGLO</w:t>
+        <w:t xml:space="preserve"> CAKPO SOGLO</w:t>
       </w:r>
     </w:p>
     <w:p>
@@ -790,13 +796,13 @@
           <w:noProof/>
         </w:rPr>
         <w:drawing>
-          <wp:anchor distT="0" distB="0" distL="114300" distR="114300" simplePos="0" relativeHeight="251659264" behindDoc="0" locked="0" layoutInCell="1" allowOverlap="1" wp14:anchorId="34DED803" wp14:editId="00F5A7D1">
+          <wp:anchor distT="0" distB="0" distL="114300" distR="114300" simplePos="0" relativeHeight="251659264" behindDoc="0" locked="0" layoutInCell="1" allowOverlap="1" wp14:anchorId="34DED803" wp14:editId="6398797B">
             <wp:simplePos x="0" y="0"/>
             <wp:positionH relativeFrom="margin">
-              <wp:posOffset>1899285</wp:posOffset>
+              <wp:posOffset>1908810</wp:posOffset>
             </wp:positionH>
             <wp:positionV relativeFrom="paragraph">
-              <wp:posOffset>302895</wp:posOffset>
+              <wp:posOffset>93345</wp:posOffset>
             </wp:positionV>
             <wp:extent cx="2818130" cy="133350"/>
             <wp:effectExtent l="0" t="0" r="1270" b="0"/>

</xml_diff>